<commit_message>
Ajusta proporciones de imágenes en manual Bio Regen 7
Co-Authored-By: Claude Sonnet 5 <noreply@anthropic.com>
</commit_message>
<xml_diff>
--- a/ekio-light-manuales/BIO_REGEN_7/Bio_Regen_7_Manual_Usuario.docx
+++ b/ekio-light-manuales/BIO_REGEN_7/Bio_Regen_7_Manual_Usuario.docx
@@ -2444,7 +2444,7 @@
       <w:r>
         <w:drawing>
           <wp:inline distT="0" distB="0" distL="0" distR="0">
-            <wp:extent cx="1428750" cy="1857375"/>
+            <wp:extent cx="1428750" cy="1781175"/>
             <wp:effectExtent t="0" r="0" b="0" l="0"/>
             <wp:docPr id="1" name="" descr="" title=""/>
             <wp:cNvGraphicFramePr>
@@ -2469,7 +2469,7 @@
                   <pic:spPr bwMode="auto">
                     <a:xfrm>
                       <a:off x="0" y="0"/>
-                      <a:ext cx="1428750" cy="1857375"/>
+                      <a:ext cx="1428750" cy="1781175"/>
                     </a:xfrm>
                     <a:prstGeom prst="rect">
                       <a:avLst/>
@@ -2694,7 +2694,7 @@
       <w:r>
         <w:drawing>
           <wp:inline distT="0" distB="0" distL="0" distR="0">
-            <wp:extent cx="1047750" cy="1238250"/>
+            <wp:extent cx="1047750" cy="1019175"/>
             <wp:effectExtent t="0" r="0" b="0" l="0"/>
             <wp:docPr id="1" name="" descr="" title=""/>
             <wp:cNvGraphicFramePr>
@@ -2719,7 +2719,7 @@
                   <pic:spPr bwMode="auto">
                     <a:xfrm>
                       <a:off x="0" y="0"/>
-                      <a:ext cx="1047750" cy="1238250"/>
+                      <a:ext cx="1047750" cy="1019175"/>
                     </a:xfrm>
                     <a:prstGeom prst="rect">
                       <a:avLst/>

</xml_diff>